<commit_message>
Sync editable assets from imported final documents
</commit_message>
<xml_diff>
--- a/public/documents/proposta-comercial.docx
+++ b/public/documents/proposta-comercial.docx
@@ -3,20 +3,138 @@
 <w:document xmlns:wpc="http://schemas.microsoft.com/office/word/2010/wordprocessingCanvas" xmlns:mo="http://schemas.microsoft.com/office/mac/office/2008/main" xmlns:mc="http://schemas.openxmlformats.org/markup-compatibility/2006" xmlns:mv="urn:schemas-microsoft-com:mac:vml" xmlns:o="urn:schemas-microsoft-com:office:office" xmlns:r="http://schemas.openxmlformats.org/officeDocument/2006/relationships" xmlns:m="http://schemas.openxmlformats.org/officeDocument/2006/math" xmlns:v="urn:schemas-microsoft-com:vml" xmlns:wp14="http://schemas.microsoft.com/office/word/2010/wordprocessingDrawing" xmlns:wp="http://schemas.openxmlformats.org/drawingml/2006/wordprocessingDrawing" xmlns:w10="urn:schemas-microsoft-com:office:word" xmlns:w="http://schemas.openxmlformats.org/wordprocessingml/2006/main" xmlns:w14="http://schemas.microsoft.com/office/word/2010/wordml" xmlns:wpg="http://schemas.microsoft.com/office/word/2010/wordprocessingGroup" xmlns:wpi="http://schemas.microsoft.com/office/word/2010/wordprocessingInk" xmlns:wne="http://schemas.microsoft.com/office/word/2006/wordml" xmlns:wps="http://schemas.microsoft.com/office/word/2010/wordprocessingShape" mc:Ignorable="w14 wp14">
   <w:body>
     <w:p>
-      <w:pPr>
-        <w:pStyle w:val="Heading1"/>
-      </w:pPr>
       <w:r>
-        <w:t>Proposta Comercial Completa - Prescripta</w:t>
+        <w:t>Proposta Comercial</w:t>
       </w:r>
     </w:p>
-    <w:p/>
     <w:p>
-      <w:pPr>
-        <w:pStyle w:val="Heading2"/>
-      </w:pPr>
       <w:r>
-        <w:t>1. Dados da oportunidade</w:t>
+        <w:t>Prescripta — Plataforma de Gestão Prescricional para Psiquiatria</w:t>
+      </w:r>
+    </w:p>
+    <w:p>
+      <w:r>
+        <w:t>Destinatário</w:t>
+      </w:r>
+    </w:p>
+    <w:p>
+      <w:r>
+        <w:t>Cliente</w:t>
+      </w:r>
+    </w:p>
+    <w:p>
+      <w:r>
+        <w:t>[Nome da clínica / profissional]</w:t>
+      </w:r>
+    </w:p>
+    <w:p>
+      <w:r>
+        <w:t>Responsável</w:t>
+      </w:r>
+    </w:p>
+    <w:p>
+      <w:r>
+        <w:t>[Nome do comprador / decisor]</w:t>
+      </w:r>
+    </w:p>
+    <w:p>
+      <w:r>
+        <w:t>Segmento</w:t>
+      </w:r>
+    </w:p>
+    <w:p>
+      <w:r>
+        <w:t>[Psiquiatra solo / Consultório / Clínica]</w:t>
+      </w:r>
+    </w:p>
+    <w:p>
+      <w:r>
+        <w:t>Cidade</w:t>
+      </w:r>
+    </w:p>
+    <w:p>
+      <w:r>
+        <w:t>[Cidade, UF]</w:t>
+      </w:r>
+    </w:p>
+    <w:p>
+      <w:r>
+        <w:t>Data da proposta</w:t>
+      </w:r>
+    </w:p>
+    <w:p>
+      <w:r>
+        <w:t>[DD/MM/AAAA]</w:t>
+      </w:r>
+    </w:p>
+    <w:p>
+      <w:r>
+        <w:t>Validade</w:t>
+      </w:r>
+    </w:p>
+    <w:p>
+      <w:r>
+        <w:t>15 dias corridos a partir da data de emissão</w:t>
+      </w:r>
+    </w:p>
+    <w:p>
+      <w:r>
+        <w:t>1. Contexto</w:t>
+      </w:r>
+    </w:p>
+    <w:p>
+      <w:r>
+        <w:t>[Descrever a situação atual do cliente conforme levantado na discovery call. Incluir: volume de pacientes</w:t>
+      </w:r>
+    </w:p>
+    <w:p>
+      <w:r>
+        <w:t>recorrentes, ferramentas utilizadas hoje, principal dor operacional identificada, impacto em retenção e</w:t>
+      </w:r>
+    </w:p>
+    <w:p>
+      <w:r>
+        <w:t>retrabalho.]</w:t>
+      </w:r>
+    </w:p>
+    <w:p>
+      <w:r>
+        <w:t>Exemplo: "Hoje, a renovação de prescrições recorrentes depende de controle manual via WhatsApp e agenda, gerando atrasos,</w:t>
+      </w:r>
+    </w:p>
+    <w:p>
+      <w:r>
+        <w:t>perda de contexto e risco de descontinuidade terapêutica."</w:t>
+      </w:r>
+    </w:p>
+    <w:p>
+      <w:r>
+        <w:t>2. Solução Proposta</w:t>
+      </w:r>
+    </w:p>
+    <w:p>
+      <w:r>
+        <w:t>A Prescripta será contratada como plataforma SaaS para estruturar a rotina operacional de prescrições</w:t>
+      </w:r>
+    </w:p>
+    <w:p>
+      <w:r>
+        <w:t>recorrentes, incluindo configuração inicial, treinamento e suporte conforme o plano escolhido.</w:t>
+      </w:r>
+    </w:p>
+    <w:p>
+      <w:r>
+        <w:t>O serviço não substitui decisão clínica nem promete cobertura regulatória fora do escopo</w:t>
+      </w:r>
+    </w:p>
+    <w:p>
+      <w:r>
+        <w:t>expressamente contratado.</w:t>
+      </w:r>
+    </w:p>
+    <w:p>
+      <w:r>
+        <w:t>Funcionalidades incluídas</w:t>
       </w:r>
     </w:p>
     <w:p>
@@ -24,7 +142,7 @@
         <w:pStyle w:val="ListBullet"/>
       </w:pPr>
       <w:r>
-        <w:t>Cliente:</w:t>
+        <w:t xml:space="preserve"> Painel de términos previstos com visão consolidada por paciente.</w:t>
       </w:r>
     </w:p>
     <w:p>
@@ -32,7 +150,7 @@
         <w:pStyle w:val="ListBullet"/>
       </w:pPr>
       <w:r>
-        <w:t>CNPJ ou CPF:</w:t>
+        <w:t xml:space="preserve"> Alertas automáticos de vencimento, retorno e renovação.</w:t>
       </w:r>
     </w:p>
     <w:p>
@@ -40,7 +158,7 @@
         <w:pStyle w:val="ListBullet"/>
       </w:pPr>
       <w:r>
-        <w:t>Responsavel:</w:t>
+        <w:t xml:space="preserve"> Fluxo operacional com status, responsável e trilha de auditoria.</w:t>
       </w:r>
     </w:p>
     <w:p>
@@ -48,7 +166,7 @@
         <w:pStyle w:val="ListBullet"/>
       </w:pPr>
       <w:r>
-        <w:t>Email:</w:t>
+        <w:t xml:space="preserve"> Preparação de contexto assistida por IA com supervisão humana.</w:t>
       </w:r>
     </w:p>
     <w:p>
@@ -56,7 +174,113 @@
         <w:pStyle w:val="ListBullet"/>
       </w:pPr>
       <w:r>
-        <w:t>Data da proposta:</w:t>
+        <w:t xml:space="preserve"> Relatórios operacionais para acompanhamento de equipe e gestão.</w:t>
+      </w:r>
+    </w:p>
+    <w:p>
+      <w:r>
+        <w:t>3. Plano e Investimento</w:t>
+      </w:r>
+    </w:p>
+    <w:p>
+      <w:r>
+        <w:t>Item</w:t>
+      </w:r>
+    </w:p>
+    <w:p>
+      <w:r>
+        <w:t>Descrição</w:t>
+      </w:r>
+    </w:p>
+    <w:p>
+      <w:r>
+        <w:t>Valor</w:t>
+      </w:r>
+    </w:p>
+    <w:p>
+      <w:r>
+        <w:t>Plano</w:t>
+      </w:r>
+    </w:p>
+    <w:p>
+      <w:r>
+        <w:t>[Start Solo / Pro Consultório / Clínica]</w:t>
+      </w:r>
+    </w:p>
+    <w:p>
+      <w:r>
+        <w:t>R$ [valor]/mês</w:t>
+      </w:r>
+    </w:p>
+    <w:p>
+      <w:r>
+        <w:t>Implantação (setup)</w:t>
+      </w:r>
+    </w:p>
+    <w:p>
+      <w:r>
+        <w:t>Configuração, mapeamento de fluxo e treinamento</w:t>
+      </w:r>
+    </w:p>
+    <w:p>
+      <w:r>
+        <w:t>R$ [valor] (único)</w:t>
+      </w:r>
+    </w:p>
+    <w:p/>
+    <w:p>
+      <w:r>
+        <w:t>Usuários incluídos</w:t>
+      </w:r>
+    </w:p>
+    <w:p>
+      <w:r>
+        <w:t>[Número] usuários</w:t>
+      </w:r>
+    </w:p>
+    <w:p>
+      <w:r>
+        <w:t>Incluído no plano</w:t>
+      </w:r>
+    </w:p>
+    <w:p>
+      <w:r>
+        <w:t>Pacientes ativos</w:t>
+      </w:r>
+    </w:p>
+    <w:p>
+      <w:r>
+        <w:t>Até [Número] pacientes</w:t>
+      </w:r>
+    </w:p>
+    <w:p>
+      <w:r>
+        <w:t>Incluído no plano</w:t>
+      </w:r>
+    </w:p>
+    <w:p>
+      <w:r>
+        <w:t>Suporte</w:t>
+      </w:r>
+    </w:p>
+    <w:p>
+      <w:r>
+        <w:t>[Assíncrono / Prioritário / Dedicado]</w:t>
+      </w:r>
+    </w:p>
+    <w:p>
+      <w:r>
+        <w:t>Incluído no plano</w:t>
+      </w:r>
+    </w:p>
+    <w:p>
+      <w:r>
+        <w:t>4. Escopo e Exclusões</w:t>
+      </w:r>
+    </w:p>
+    <w:p>
+      <w:r>
+        <w:t>Incluído</w:t>
       </w:r>
     </w:p>
     <w:p>
@@ -64,35 +288,7 @@
         <w:pStyle w:val="ListBullet"/>
       </w:pPr>
       <w:r>
-        <w:t>Validade:</w:t>
-      </w:r>
-    </w:p>
-    <w:p/>
-    <w:p>
-      <w:pPr>
-        <w:pStyle w:val="Heading2"/>
-      </w:pPr>
-      <w:r>
-        <w:t>2. Resumo executivo</w:t>
-      </w:r>
-    </w:p>
-    <w:p>
-      <w:r>
-        <w:t>A Prescripta e uma plataforma SaaS B2B focada em infraestrutura operacional para recorrencia prescricional em psiquiatria privada. O objetivo desta proposta e estruturar o fluxo operacional entre termino previsto, retorno, renovacao, confirmacao e acompanhamento da recorrencia prescricional, com supervisao humana e governanca adequada ao contexto de saude.</w:t>
-      </w:r>
-    </w:p>
-    <w:p/>
-    <w:p>
-      <w:pPr>
-        <w:pStyle w:val="Heading2"/>
-      </w:pPr>
-      <w:r>
-        <w:t>3. Dor observada no discovery</w:t>
-      </w:r>
-    </w:p>
-    <w:p>
-      <w:r>
-        <w:t>Preencher com o problema dominante da conta:</w:t>
+        <w:t xml:space="preserve"> Acesso à plataforma conforme plano contratado.</w:t>
       </w:r>
     </w:p>
     <w:p>
@@ -100,7 +296,7 @@
         <w:pStyle w:val="ListBullet"/>
       </w:pPr>
       <w:r>
-        <w:t>[ ] Retrabalho entre agenda, WhatsApp e planilhas</w:t>
+        <w:t xml:space="preserve"> Configuração inicial e mapeamento de fluxo operacional.</w:t>
       </w:r>
     </w:p>
     <w:p>
@@ -108,7 +304,7 @@
         <w:pStyle w:val="ListBullet"/>
       </w:pPr>
       <w:r>
-        <w:t>[ ] Falta de visibilidade sobre prazos e pendencias</w:t>
+        <w:t xml:space="preserve"> Treinamento da equipe (médico, recepção, administração).</w:t>
       </w:r>
     </w:p>
     <w:p>
@@ -116,7 +312,7 @@
         <w:pStyle w:val="ListBullet"/>
       </w:pPr>
       <w:r>
-        <w:t>[ ] Baixa continuidade entre consulta e renovacao</w:t>
+        <w:t xml:space="preserve"> Suporte conforme SLA do plano.</w:t>
       </w:r>
     </w:p>
     <w:p>
@@ -124,7 +320,12 @@
         <w:pStyle w:val="ListBullet"/>
       </w:pPr>
       <w:r>
-        <w:t>[ ] Falta de fila central e ownership operacional</w:t>
+        <w:t xml:space="preserve"> Acompanhamento de ativação por 30 dias após go-live.</w:t>
+      </w:r>
+    </w:p>
+    <w:p>
+      <w:r>
+        <w:t>Não incluído</w:t>
       </w:r>
     </w:p>
     <w:p>
@@ -132,83 +333,235 @@
         <w:pStyle w:val="ListBullet"/>
       </w:pPr>
       <w:r>
-        <w:t>[ ] Risco de crescimento sem processo</w:t>
+        <w:t xml:space="preserve"> Integrações com sistemas de terceiros não previstos nesta proposta.</w:t>
+      </w:r>
+    </w:p>
+    <w:p>
+      <w:pPr>
+        <w:pStyle w:val="ListBullet"/>
+      </w:pPr>
+      <w:r>
+        <w:t xml:space="preserve"> Fluxos regulatórios de controlados e SNCR (em roadmap).</w:t>
+      </w:r>
+    </w:p>
+    <w:p>
+      <w:pPr>
+        <w:pStyle w:val="ListBullet"/>
+      </w:pPr>
+      <w:r>
+        <w:t xml:space="preserve"> Assinatura digital qualificada ICP-Brasil (em roadmap).</w:t>
+      </w:r>
+    </w:p>
+    <w:p>
+      <w:pPr>
+        <w:pStyle w:val="ListBullet"/>
+      </w:pPr>
+      <w:r>
+        <w:t xml:space="preserve"> Personalizações fora do escopo funcional da plataforma.</w:t>
+      </w:r>
+    </w:p>
+    <w:p>
+      <w:pPr>
+        <w:pStyle w:val="ListBullet"/>
+      </w:pPr>
+      <w:r>
+        <w:t xml:space="preserve"> Suporte presencial (disponível sob orçamento separado).</w:t>
+      </w:r>
+    </w:p>
+    <w:p>
+      <w:r>
+        <w:t>5. Cronograma</w:t>
+      </w:r>
+    </w:p>
+    <w:p>
+      <w:r>
+        <w:t>Etapa</w:t>
+      </w:r>
+    </w:p>
+    <w:p>
+      <w:r>
+        <w:t>Prazo</w:t>
+      </w:r>
+    </w:p>
+    <w:p>
+      <w:r>
+        <w:t>Responsável</w:t>
+      </w:r>
+    </w:p>
+    <w:p>
+      <w:r>
+        <w:t>Assinatura do contrato</w:t>
+      </w:r>
+    </w:p>
+    <w:p>
+      <w:r>
+        <w:t>D+0</w:t>
+      </w:r>
+    </w:p>
+    <w:p>
+      <w:r>
+        <w:t>Cliente + Prescripta</w:t>
+      </w:r>
+    </w:p>
+    <w:p>
+      <w:r>
+        <w:t>Kickoff e mapeamento de fluxo</w:t>
+      </w:r>
+    </w:p>
+    <w:p>
+      <w:r>
+        <w:t>D+1 a D+3</w:t>
+      </w:r>
+    </w:p>
+    <w:p>
+      <w:r>
+        <w:t>Prescripta</w:t>
+      </w:r>
+    </w:p>
+    <w:p>
+      <w:r>
+        <w:t>Configuração e setup</w:t>
+      </w:r>
+    </w:p>
+    <w:p>
+      <w:r>
+        <w:t>D+3 a D+7</w:t>
+      </w:r>
+    </w:p>
+    <w:p>
+      <w:r>
+        <w:t>Prescripta</w:t>
+      </w:r>
+    </w:p>
+    <w:p>
+      <w:r>
+        <w:t>Treinamento da equipe</w:t>
+      </w:r>
+    </w:p>
+    <w:p>
+      <w:r>
+        <w:t>D+7 a D+10</w:t>
+      </w:r>
+    </w:p>
+    <w:p>
+      <w:r>
+        <w:t>Prescripta + Cliente</w:t>
+      </w:r>
+    </w:p>
+    <w:p>
+      <w:r>
+        <w:t>Go-live assistido</w:t>
+      </w:r>
+    </w:p>
+    <w:p>
+      <w:r>
+        <w:t>D+10</w:t>
+      </w:r>
+    </w:p>
+    <w:p>
+      <w:r>
+        <w:t>Prescripta</w:t>
+      </w:r>
+    </w:p>
+    <w:p>
+      <w:r>
+        <w:t>Revisão de ativação (30 dias)</w:t>
+      </w:r>
+    </w:p>
+    <w:p>
+      <w:r>
+        <w:t>D+40</w:t>
+      </w:r>
+    </w:p>
+    <w:p>
+      <w:r>
+        <w:t>Prescripta</w:t>
+      </w:r>
+    </w:p>
+    <w:p>
+      <w:r>
+        <w:t>6. Premissas</w:t>
+      </w:r>
+    </w:p>
+    <w:p>
+      <w:pPr>
+        <w:pStyle w:val="ListBullet"/>
+      </w:pPr>
+      <w:r>
+        <w:t xml:space="preserve"> O Cliente designará um responsável operacional para acompanhar a implantação.</w:t>
+      </w:r>
+    </w:p>
+    <w:p>
+      <w:pPr>
+        <w:pStyle w:val="ListBullet"/>
+      </w:pPr>
+      <w:r>
+        <w:t xml:space="preserve"> O treinamento requer disponibilidade da equipe conforme cronograma acordado.</w:t>
+      </w:r>
+    </w:p>
+    <w:p>
+      <w:pPr>
+        <w:pStyle w:val="ListBullet"/>
+      </w:pPr>
+      <w:r>
+        <w:t xml:space="preserve"> A Prescripta atuará como operadora de dados pessoais, conforme DPA em anexo.</w:t>
+      </w:r>
+    </w:p>
+    <w:p>
+      <w:pPr>
+        <w:pStyle w:val="ListBullet"/>
+      </w:pPr>
+      <w:r>
+        <w:t xml:space="preserve"> O contrato é mensal com renovação automática e cancelamento sem multa com 30 dias de aviso.</w:t>
+      </w:r>
+    </w:p>
+    <w:p>
+      <w:pPr>
+        <w:pStyle w:val="ListBullet"/>
+      </w:pPr>
+      <w:r>
+        <w:t xml:space="preserve"> A plataforma não substitui o julgamento clínico do profissional habilitado.</w:t>
       </w:r>
     </w:p>
     <w:p/>
     <w:p>
-      <w:pPr>
-        <w:pStyle w:val="Heading2"/>
-      </w:pPr>
       <w:r>
-        <w:t>4. Escopo contratado</w:t>
+        <w:t>7. Próximos Passos</w:t>
       </w:r>
     </w:p>
     <w:p>
       <w:r>
-        <w:t>Esta proposta contempla licenca de uso da plataforma, configuracao operacional inicial, treinamento por perfil, suporte conforme plano e revisao de ativacao. Nao fazem parte do escopo padrao prontuario generico, decisao clinica automatizada, integracoes nao aprovadas e funcionalidades em roadmap regulatorio sem formalizacao.</w:t>
-      </w:r>
-    </w:p>
-    <w:p/>
-    <w:p>
-      <w:pPr>
-        <w:pStyle w:val="Heading2"/>
-      </w:pPr>
-      <w:r>
-        <w:t>5. Planos e investimento</w:t>
+        <w:t>1. Revisão desta proposta pelo cliente.</w:t>
       </w:r>
     </w:p>
     <w:p>
       <w:r>
-        <w:t>| Plano | Perfil | Valor recorrente | Setup |</w:t>
+        <w:t>2. Validação de requisitos jurídico-operacionais (DPA, Termos).</w:t>
       </w:r>
     </w:p>
     <w:p>
       <w:r>
-        <w:t>| --- | --- | --- | --- |</w:t>
+        <w:t>3. Assinatura do contrato e faturamento do setup.</w:t>
       </w:r>
     </w:p>
     <w:p>
       <w:r>
-        <w:t>| Start Solo | psiquiatra individual | R$ 349/mes | incluido |</w:t>
+        <w:t>4. Agendamento do kickoff.</w:t>
       </w:r>
     </w:p>
     <w:p>
       <w:r>
-        <w:t>| Clinica | estrutura multiprofissional | R$ 2.490/mes | sob definicao em proposta |</w:t>
+        <w:t>Elaborado por: [Nome] — Prescripta / Concordia MedOps</w:t>
       </w:r>
     </w:p>
     <w:p>
       <w:r>
-        <w:t>| Enterprise | rede, grupo ou parceiro | sob proposta | sob proposta |</w:t>
-      </w:r>
-    </w:p>
-    <w:p/>
-    <w:p>
-      <w:pPr>
-        <w:pStyle w:val="Heading2"/>
-      </w:pPr>
-      <w:r>
-        <w:t>6. Premissas e cronograma</w:t>
+        <w:t>Contato: [email] | [telefone]</w:t>
       </w:r>
     </w:p>
     <w:p>
       <w:r>
-        <w:t>A contratacao segue o escopo e limite do plano aprovado. Requisitos especiais de seguranca, SLA, SSO, rollout por unidade, customizacao ou integracao serao objeto de escopo adicional. Cronograma sugerido: semana 1 assinatura e kickoff; semana 2 configuracao; semana 3 treinamento; semana 4 go-live; semana 6 revisao de ativacao.</w:t>
-      </w:r>
-    </w:p>
-    <w:p/>
-    <w:p>
-      <w:pPr>
-        <w:pStyle w:val="Heading2"/>
-      </w:pPr>
-      <w:r>
-        <w:t>7. Base juridica e aceite</w:t>
-      </w:r>
-    </w:p>
-    <w:p>
-      <w:r>
-        <w:t>O relacionamento sera regulado pelo contrato SaaS, DPA e politicas vigentes da Prescripta. Nome: Cargo: Assinatura: Data:. Esta proposta e uma minuta comercial base e deve ser revisada antes do envio final a cada cliente.</w:t>
+        <w:t>Anexos: Termos de Uso, Política de Privacidade, DPA, Política de IA.</w:t>
       </w:r>
     </w:p>
     <w:sectPr>

</xml_diff>